<commit_message>
Simplify two-axis LDR control and add flowchart
Co-authored-by: arena-agent <297053741+arena-agent@users.noreply.github.com>
</commit_message>
<xml_diff>
--- a/bao_cao_mau_do_an_dieu_khien_bam_mat_troi.docx
+++ b/bao_cao_mau_do_an_dieu_khien_bam_mat_troi.docx
@@ -97,12 +97,7 @@
         <w:jc w:val="center"/>
       </w:pPr>
       <w:r>
-        <w:rPr>
-          <w:rFonts w:ascii="Times New Roman" w:hAnsi="Times New Roman" w:eastAsia="Times New Roman"/>
-          <w:i/>
-          <w:sz w:val="24"/>
-        </w:rPr>
-        <w:t>Phương án mô hình hai trục kết hợp tính toán thiên văn và cảm biến quang</w:t>
+        <w:t>Phương án mô hình hai trục điều khiển bằng so sánh điện trở của 4 LDR</w:t>
       </w:r>
     </w:p>
     <w:p>
@@ -212,7 +207,7 @@
     <w:p>
       <w:pPr/>
       <w:r>
-        <w:t>Báo cáo tập trung đề xuất bộ điều khiển kết hợp vị trí Mặt Trời tính từ ngày, giờ và tọa độ với phản hồi quang từ bốn LDR đặt ở bốn góc mặt pin. Cụm cảm biến được gá nghiêng đối xứng hướng ra ngoài để tạo hai sai lệch độc lập; một servo vị trí điều khiển phương vị quay tấm pin, còn một động cơ DC giảm tốc có encoder điều chỉnh độ nghiêng. Công tắc hành trình bảo vệ hai cơ cấu.</w:t>
+        <w:t>Báo cáo tập trung vào thuật toán so sánh điện trở của bốn LDR đặt ở bốn góc mặt pin. Khi một phía có điện trở nhỏ hơn, tấm pin được nghiêng hoặc xoay từng bước về phía đó; khi các cặp gần cân bằng, cơ cấu dừng, chờ một khoảng thời gian rồi tự đọc lại cảm biến để hiệu chỉnh tiếp.</w:t>
       </w:r>
     </w:p>
     <w:p>
@@ -358,21 +353,13 @@
     <w:p>
       <w:pPr/>
       <w:r>
-        <w:rPr>
-          <w:rFonts w:ascii="Times New Roman" w:hAnsi="Times New Roman" w:eastAsia="Times New Roman"/>
-          <w:sz w:val="24"/>
-        </w:rPr>
-        <w:t>Các mô hình chi phí thấp thường dùng LDR để dò ánh sáng, nhưng tín hiệu có thể bị ảnh hưởng bởi mây, bóng che cục bộ, chênh lệch cảm biến và phản xạ. Nếu chỉ điều khiển theo cảm biến, hệ thống dễ quay liên tục hoặc đi sai hướng khi tín hiệu yếu. Ngược lại, tính toán thiên văn có thể cung cấp góc tham chiếu ổn định nhưng không tự bù được sai số lắp ráp và căn chỉnh. Vì vậy, nghiên cứu phương án lai giữa mô hình thiên văn và phản hồi quang có ý nghĩa đối với độ ổn định của hệ thống.</w:t>
+        <w:t>Các mô hình dùng cảm biến quang cần xử lý sai khác giữa các cảm biến, nhiễu và bóng che. Với bốn LDR đặt ở bốn góc, việc so sánh hai cặp chéo giúp xác định phía có điện trở nhỏ hơn, tức phía nhận ánh sáng mạnh hơn. Điều khiển từng bước và đọc lại sau một khoảng thời gian giúp cơ cấu căn chỉnh mà không phải quay liên tục.</w:t>
       </w:r>
     </w:p>
     <w:p>
       <w:pPr/>
       <w:r>
-        <w:rPr>
-          <w:rFonts w:ascii="Times New Roman" w:hAnsi="Times New Roman" w:eastAsia="Times New Roman"/>
-          <w:sz w:val="24"/>
-        </w:rPr>
-        <w:t>Đề tài được lựa chọn nhằm đề xuất cấu trúc bám nắng hai trục dùng Arduino, cảm biến quang, servo vị trí và công tắc hành trình; đồng thời xây dựng cách kiểm tra sai số góc, độ tin cậy và năng lượng thuần thay vì chỉ dựa vào chuyển động hoặc điện áp tức thời.</w:t>
+        <w:t>Đề tài được lựa chọn nhằm xây dựng thuật toán bám nắng hai trục dùng bốn LDR, servo phương vị và động cơ điều chỉnh độ nghiêng; tập trung vào cách so sánh điện trở, xác định chiều chuyển động, giới hạn hành trình và chu kỳ đọc lại cảm biến.</w:t>
       </w:r>
     </w:p>
     <w:p>
@@ -392,11 +379,7 @@
     <w:p>
       <w:pPr/>
       <w:r>
-        <w:rPr>
-          <w:rFonts w:ascii="Times New Roman" w:hAnsi="Times New Roman" w:eastAsia="Times New Roman"/>
-          <w:sz w:val="24"/>
-        </w:rPr>
-        <w:t>Photodiode được khảo sát như một lựa chọn cảm biến quang có đáp ứng nhanh, nhưng cấu hình đề xuất dùng LDR vì tính phổ biến và dễ lắp. Mục tiêu của phương án lai là dùng góc thiên văn làm đường đặt nền, không để nhiễu quang chi phối cơ cấu; các điều kiện chuyển chế độ, vùng chết và hành trình an toàn được mô tả trong Chương 3.</w:t>
+        <w:t>Thuật toán đề xuất không cần tính góc đặt thiên văn trong vòng điều khiển chính: bộ điều khiển so sánh các cặp LDR, dịch chuyển từng bước về phía có điện trở nhỏ hơn, dừng khi sai lệch nằm trong ngưỡng và định kỳ đọc lại để hiệu chỉnh.</w:t>
       </w:r>
     </w:p>
     <w:p>
@@ -410,11 +393,7 @@
     <w:p>
       <w:pPr/>
       <w:r>
-        <w:rPr>
-          <w:rFonts w:ascii="Times New Roman" w:hAnsi="Times New Roman" w:eastAsia="Times New Roman"/>
-          <w:sz w:val="24"/>
-        </w:rPr>
-        <w:t>Mục tiêu tổng quát là xây dựng phương án điều khiển hướng cho mô hình tấm pin hai trục, kết hợp tính toán góc Mặt Trời và hiệu chỉnh cảm biến, bảo đảm chuyển động trong giới hạn cơ khí. Các mục tiêu cụ thể gồm:</w:t>
+        <w:t>Mục tiêu tổng quát là xây dựng thuật toán điều khiển mô hình tấm pin hai trục bằng cách so sánh điện trở của bốn LDR, điều khiển lần lượt hướng nghiêng và hướng xoay, sau đó tự đọc lại theo chu kỳ để duy trì trạng thái cân bằng ánh sáng.</w:t>
       </w:r>
     </w:p>
     <w:p>
@@ -424,11 +403,7 @@
         <w:ind w:left="504" w:hanging="259"/>
       </w:pPr>
       <w:r>
-        <w:rPr>
-          <w:rFonts w:ascii="Times New Roman" w:hAnsi="Times New Roman" w:eastAsia="Times New Roman"/>
-          <w:sz w:val="23"/>
-        </w:rPr>
-        <w:t>Tổng hợp nguyên lý các linh kiện và phương pháp bám nắng; xác định quy ước tọa độ, góc cao và phương vị.</w:t>
+        <w:t>Tổng hợp nguyên lý các linh kiện, phương pháp bám nắng và quy ước xác định hướng nghiêng, hướng xoay của tấm pin.</w:t>
       </w:r>
     </w:p>
     <w:p>
@@ -448,11 +423,7 @@
         <w:ind w:left="504" w:hanging="259"/>
       </w:pPr>
       <w:r>
-        <w:rPr>
-          <w:rFonts w:ascii="Times New Roman" w:hAnsi="Times New Roman" w:eastAsia="Times New Roman"/>
-          <w:sz w:val="23"/>
-        </w:rPr>
-        <w:t>Xây dựng thuật toán tính góc tham chiếu, đánh giá chất lượng LDR, hiệu chỉnh có điều kiện và xử lý lỗi an toàn.</w:t>
+        <w:t>Xây dựng quy tắc so sánh hai cặp LDR chéo, xác định phía có điện trở nhỏ hơn, điều khiển cơ cấu theo bước và đọc lại sau thời gian đặt trước.</w:t>
       </w:r>
     </w:p>
     <w:p>
@@ -462,11 +433,7 @@
         <w:ind w:left="504" w:hanging="259"/>
       </w:pPr>
       <w:r>
-        <w:rPr>
-          <w:rFonts w:ascii="Times New Roman" w:hAnsi="Times New Roman" w:eastAsia="Times New Roman"/>
-          <w:sz w:val="23"/>
-        </w:rPr>
-        <w:t>Lập quy trình thử nghiệm so sánh tấm pin cố định, bám thiên văn, bám cảm biến và điều khiển lai bằng sai số góc và năng lượng thuần.</w:t>
+        <w:t>Lập quy trình kiểm tra hướng chuyển động, ngưỡng cân bằng, thời gian đọc lại và so sánh năng lượng với tấm pin cố định.</w:t>
       </w:r>
     </w:p>
     <w:p>
@@ -486,11 +453,7 @@
     <w:p>
       <w:pPr/>
       <w:r>
-        <w:rPr>
-          <w:rFonts w:ascii="Times New Roman" w:hAnsi="Times New Roman" w:eastAsia="Times New Roman"/>
-          <w:sz w:val="24"/>
-        </w:rPr>
-        <w:t>Phạm vi tập trung vào tính toán vị trí Mặt Trời, xử lý tín hiệu quang, chuyển đổi góc đặt và bảo vệ cơ cấu. Báo cáo không thiết kế nghịch lưu hòa lưới, không tối ưu thuật toán MPPT, không khẳng định kết quả tăng sản lượng khi chưa có phép đo và không xem xét đầy đủ kết cấu tracker quy mô nhà máy, tải gió chuyên dụng hoặc phân tích kinh tế dài hạn.</w:t>
+        <w:t>Phạm vi tập trung vào đo điện trở LDR, so sánh hai hướng nghiêng/quay, điều khiển hai cơ cấu chấp hành theo bước, đặt thời gian đọc lại và bảo vệ hành trình.</w:t>
       </w:r>
     </w:p>
     <w:p>
@@ -532,11 +495,7 @@
         <w:ind w:left="504" w:hanging="259"/>
       </w:pPr>
       <w:r>
-        <w:rPr>
-          <w:rFonts w:ascii="Times New Roman" w:hAnsi="Times New Roman" w:eastAsia="Times New Roman"/>
-          <w:sz w:val="23"/>
-        </w:rPr>
-        <w:t>Thuật toán điều khiển lai có kiểm tra chất lượng cảm biến, vùng chết, xử lý trường hợp mất tín hiệu và chế độ an toàn.</w:t>
+        <w:t>Thuật toán so sánh điện trở 4 LDR, điều khiển servo phương vị và động cơ nghiêng từng bước, dừng khi gần cân bằng và tự đọc lại theo chu kỳ.</w:t>
       </w:r>
     </w:p>
     <w:p>
@@ -1314,11 +1273,7 @@
     <w:p>
       <w:pPr/>
       <w:r>
-        <w:rPr>
-          <w:rFonts w:ascii="Times New Roman" w:hAnsi="Times New Roman" w:eastAsia="Times New Roman"/>
-          <w:sz w:val="24"/>
-        </w:rPr>
-        <w:t>Phương pháp lai dùng góc tính toán làm đường bám chính hoặc giá trị dự phòng, còn cảm biến quang chỉ bù một lượng nhỏ khi độ sáng và độ ổn định đạt điều kiện. Bộ điều khiển có thể đánh giá tổng cường độ, độ biến động, độ bão hòa và tính hợp lý của cặp cảm biến; khi tín hiệu không đạt, giảm trọng số hiệu chỉnh về không, giữ vị trí hoặc tiếp tục theo góc thiên văn. Dùng hai ngưỡng bật/tắt khác nhau tạo trễ (hysteresis), tránh chuyển chế độ liên tục. Đây là phương án phù hợp với đề tài vì kết hợp được tính ổn định của mô hình với khả năng tự hiệu chuẩn của cảm biến [4, 6].</w:t>
+        <w:t>Phương pháp lai dùng góc tính toán làm đường bám chính hoặc giá trị dự phòng, còn cảm biến quang chỉ bù một lượng nhỏ khi độ sáng và độ ổn định đạt điều kiện. Bộ điều khiển có thể đánh giá tổng cường độ, độ biến động, độ bão hòa và tính hợp lý của cặp cảm biến; khi tín hiệu không đạt, giảm trọng số hiệu chỉnh về không, giữ vị trí hoặc tiếp tục theo góc thiên văn. Dùng hai ngưỡng bật/tắt khác nhau tạo trễ (hysteresis), tránh chuyển chế độ liên tục. Đây là một phương án tổng quan có thể dùng khi cần kết hợp hai nguồn thông tin [4, 6]. Báo cáo này không triển khai điều khiển lai; phương án được chọn trình bày tại Chương 3 là so sánh trực tiếp điện trở của bốn LDR.</w:t>
       </w:r>
     </w:p>
     <w:p>
@@ -1458,11 +1413,7 @@
     <w:p>
       <w:pPr/>
       <w:r>
-        <w:rPr>
-          <w:rFonts w:ascii="Times New Roman" w:hAnsi="Times New Roman" w:eastAsia="Times New Roman"/>
-          <w:sz w:val="24"/>
-        </w:rPr>
-        <w:t>Việc lựa chọn cần cân bằng sai số góc, năng lượng thuần sau khi trừ điện năng truyền động, giá thành, tải gió, độ bền, bảo trì, độ phức tạp và khả năng vận hành khi mây hoặc mất cảm biến. Với mô hình một trục, phương án lai thiên văn–LDR có vùng chết và chế độ giữ vị trí khi tín hiệu kém là lựa chọn đề xuất; với mô hình hai trục, dùng SPA làm đường đặt nền và LDR chỉ hiệu chỉnh có điều kiện giúp hạn chế phụ thuộc vào tín hiệu quang. Hiệu quả của mỗi phương án chỉ có thể kết luận sau khi thử nghiệm cùng điều kiện với tấm pin cố định.</w:t>
+        <w:t>Việc lựa chọn ngưỡng cân bằng và bước dịch chuyển cần cân bằng giữa độ nhạy, rung cơ cấu, thời gian đáp ứng và độ bền. Với mô hình hai trục này, đề xuất so sánh điện trở tổng hợp của hai phía đối diện; trục nào chênh lệch vượt ngưỡng thì dịch chuyển từng bước về phía có điện trở nhỏ hơn. Khi cả hai trục gần cân bằng, dừng cơ cấu, chờ T_đọc rồi lấy mẫu mới. Hiệu quả chỉ được kết luận sau khi thử nghiệm cùng điều kiện với tấm pin cố định.</w:t>
       </w:r>
     </w:p>
     <w:tbl>
@@ -2535,7 +2486,7 @@
         <w:jc w:val="both"/>
       </w:pPr>
       <w:r>
-        <w:t>Sơ đồ khối chức năng: bốn LDR → lọc/hiệu chuẩn → e_quay, e_nghiêng → bộ điều khiển → servo phương vị và motor nghiêng → tấm pin. Encoder hồi tiếp góc của trục nghiêng; công tắc hành trình và giới hạn mềm có quyền ngắt lệnh bất kể sai lệch cảm biến.</w:t>
+        <w:t>Sơ đồ khối chức năng: bốn LDR → lọc/hiệu chuẩn và quy đổi điện trở → e_nghiêng = R_trên − R_dưới, e_quay = R_trái − R_phải → bộ điều khiển → servo phương vị và motor nghiêng → tấm pin. Encoder giám sát góc trục nghiêng; công tắc hành trình và giới hạn mềm có quyền chặn lệnh bất kể sai lệch cảm biến.</w:t>
       </w:r>
     </w:p>
     <w:p>
@@ -2903,7 +2854,7 @@
         <w:jc w:val="both"/>
       </w:pPr>
       <w:r>
-        <w:t>Nguồn servo và motor được chọn theo dòng khởi động/kẹt trục, không lấy từ chân 5 V Arduino. Nối mass tham chiếu đúng cách, đặt tụ lọc gần driver, tách đường motor khỏi đường ADC và dùng bảo vệ quá dòng/quá áp phù hợp. Động cơ nghiêng cần encoder hoặc cảm biến góc để biết vị trí thực; nếu không có hồi tiếp, PI vị trí không thể hoạt động đúng.</w:t>
+        <w:t>Nguồn servo và motor được chọn theo dòng khởi động/kẹt trục, không lấy từ chân 5 V Arduino. Nối mass tham chiếu đúng cách, đặt tụ lọc gần driver, tách đường motor khỏi đường ADC và dùng bảo vệ quá dòng/quá áp phù hợp. Động cơ nghiêng cần encoder hoặc cảm biến góc để giám sát vị trí và xác nhận chuyển động theo từng bước; chiều điều khiển được xác định từ so sánh các LDR.</w:t>
       </w:r>
     </w:p>
     <w:p>
@@ -2911,7 +2862,7 @@
         <w:pStyle w:val="Heading2"/>
       </w:pPr>
       <w:r>
-        <w:t>3.3. Mô hình hình học và tính góc đặt</w:t>
+        <w:t>3.3. Quy đổi điện trở và xác định phía cần chuyển động</w:t>
       </w:r>
     </w:p>
     <w:p>
@@ -2919,46 +2870,7 @@
         <w:jc w:val="both"/>
       </w:pPr>
       <w:r>
-        <w:t>Cụm LDR tạo hai sai lệch quang chính bằng tổng tín hiệu hai phía đối diện. Với S = L_TT + L_PT + L_TD + L_PD + ε, sai lệch quay và nghiêng được xác định như sau; dấu phải kiểm tra khi lắp thực tế:</w:t>
-      </w:r>
-    </w:p>
-    <w:p>
-      <w:pPr>
-        <w:spacing w:before="60" w:after="140"/>
-        <w:ind w:firstLine="0"/>
-        <w:jc w:val="center"/>
-      </w:pPr>
-      <w:r>
-        <w:rPr>
-          <w:i/>
-        </w:rPr>
-        <w:t>e_quay = [(L_PT + L_PD) − (L_TT + L_TD)] / S</w:t>
-      </w:r>
-    </w:p>
-    <w:p>
-      <w:pPr>
-        <w:spacing w:before="60" w:after="140"/>
-        <w:ind w:firstLine="0"/>
-        <w:jc w:val="center"/>
-      </w:pPr>
-      <w:r>
-        <w:rPr>
-          <w:i/>
-        </w:rPr>
-        <w:t>e_nghiêng = [(L_TT + L_PT) − (L_TD + L_PD)] / S</w:t>
-      </w:r>
-    </w:p>
-    <w:p>
-      <w:pPr>
-        <w:spacing w:before="60" w:after="140"/>
-        <w:ind w:firstLine="0"/>
-        <w:jc w:val="center"/>
-      </w:pPr>
-      <w:r>
-        <w:rPr>
-          <w:i/>
-        </w:rPr>
-        <w:t>e_chéo = [(L_TT + L_PD) − (L_PT + L_TD)] / S</w:t>
+        <w:t>Bốn LDR được mắc giống nhau theo cấu hình 3,3 V → điện trở cố định R_f → nút ADC → LDR → GND. Vi điều khiển chuyển số ADC thành điện áp V_ADC theo hiệu chuẩn của bo mạch, sau đó tính điện trở từng cảm biến: R_LDR = R_f × V_ADC/(3,3 − V_ADC). Điện trở nhỏ hơn biểu thị cảm biến nhận ánh sáng mạnh hơn. Nếu đảo vị trí LDR và R_f trong cầu phân áp thì phải đổi công thức quy đổi.</w:t>
       </w:r>
     </w:p>
     <w:p>
@@ -2966,7 +2878,7 @@
         <w:jc w:val="both"/>
       </w:pPr>
       <w:r>
-        <w:t>e_chéo dùng để phát hiện trường hợp chiếu sáng bất đối xứng hoặc một cảm biến bị che; chỉ e_quay và e_nghiêng tạo lệnh hai trục. Khi tín hiệu đủ sáng và hợp lệ, góc đặt cập nhật theo θ*_i,k+1 = sat[θ*_i,k + K_i f(e_i, δ_i), θ_i,min, θ_i,max], trong đó i lần lượt là quay hoặc nghiêng, δ_i là vùng chết, K_i là hệ số hiệu chỉnh và sat giới hạn hành trình. Khi tín hiệu quang không hợp lệ, dùng góc SPA làm giá trị nền hoặc giữ vị trí theo chính sách an toàn.</w:t>
+        <w:t>Ký hiệu R_TT, R_PT, R_TD, R_PD lần lượt là điện trở tại góc trên-trái, trên-phải, dưới-trái và dưới-phải. So sánh chéo hai cặp đối diện (R_TT với R_PD) và (R_PT với R_TD), rồi tổng hợp theo hai hướng: R_trên = R_TT + R_PT; R_dưới = R_TD + R_PD; R_trái = R_TT + R_TD; R_phải = R_PT + R_PD. Có thể dùng ngưỡng δ_nghiêng và δ_quay để xác định mức “gần bằng nhau”.</w:t>
       </w:r>
     </w:p>
     <w:p>
@@ -2974,7 +2886,15 @@
         <w:jc w:val="both"/>
       </w:pPr>
       <w:r>
-        <w:t>Góc servo thực tế cần cộng offset zero và đổi theo dải làm việc đã hiệu chuẩn. Góc nghiêng lệnh được so sánh với góc đo từ encoder: e_pos = θ_nghiêng* − θ_nghiêng,đo. Việc tách sai lệch quang (hướng cần bám) với sai số vị trí (mức motor còn phải chạy) giúp tránh nhầm hai đại lượng.</w:t>
+        <w:t>Nếu R_trên nhỏ hơn R_dưới vượt ngưỡng, phía trên nhận sáng mạnh hơn nên motor nghiêng dịch chuyển một bước nhỏ về phía trên; nếu R_dưới nhỏ hơn R_trên thì nghiêng về phía dưới. Tương tự, nếu R_trái nhỏ hơn R_phải thì servo xoay về trái; nếu R_phải nhỏ hơn R_trái thì servo xoay về phải. Chiều trái/phải và trên/dưới phải được xác nhận khi lắp cảm biến; nếu chiều cơ khí ngược, hiệu chỉnh ánh xạ lệnh.</w:t>
+      </w:r>
+    </w:p>
+    <w:p>
+      <w:pPr>
+        <w:jc w:val="both"/>
+      </w:pPr>
+      <w:r>
+        <w:t>Servo phương vị thay đổi góc đặt theo từng bước nhỏ Δθ_quay, giới hạn trong hành trình cho phép. Motor DC giảm tốc điều chỉnh độ nghiêng bằng cầu H: chọn chiều quay theo phía có điện trở nhỏ hơn, chạy PWM trong một bước ngắn hoặc đến khi encoder ghi nhận Δθ_nghiêng rồi dừng. Công tắc hành trình luôn có quyền chặn lệnh đi quá giới hạn.</w:t>
       </w:r>
     </w:p>
     <w:p>
@@ -2990,7 +2910,7 @@
         <w:jc w:val="both"/>
       </w:pPr>
       <w:r>
-        <w:t>Hiệu chuẩn bốn LDR dưới cùng điều kiện sáng để đo offset và hệ số độ lợi; sau đó đặt cảm biến trên giá quay, chiếu sáng từ trái, phải, trên, dưới và các hướng chéo. Ghi L_TT, L_PT, L_TD, L_PD theo góc chiếu, xác nhận e_quay/e_nghiêng đổi dấu đúng khi hướng sáng đi qua pháp tuyến và quan hệ tín hiệu đủ đơn điệu trong dải làm việc.</w:t>
+        <w:t>Hiệu chuẩn bốn LDR dưới cùng điều kiện sáng để đo offset và hệ số độ lợi; sau đó đặt cảm biến trên giá quay, chiếu sáng từ trái, phải, trên, dưới và các hướng chéo. Ghi R_TT, R_PT, R_TD, R_PD sau khi quy đổi theo góc chiếu; xác nhận e_quay = R_trái − R_phải và e_nghiêng = R_trên − R_dưới đổi dấu đúng khi hướng sáng đi qua pháp tuyến, đồng thời quan hệ tín hiệu đủ đơn điệu trong dải làm việc.</w:t>
       </w:r>
     </w:p>
     <w:p>
@@ -3014,7 +2934,7 @@
         <w:pStyle w:val="Heading2"/>
       </w:pPr>
       <w:r>
-        <w:t>3.5. Thuật toán điều khiển lai</w:t>
+        <w:t>3.5. Thuật toán điều khiển theo so sánh điện trở 4 LDR</w:t>
       </w:r>
     </w:p>
     <w:p>
@@ -3022,7 +2942,16 @@
         <w:jc w:val="both"/>
       </w:pPr>
       <w:r>
-        <w:t>Sau khi lọc các mẫu ADC và bù sai lệch cảm biến, tính e_quay, e_nghiêng, e_chéo và cờ chất lượng q. Với mỗi trục, định nghĩa f(e,δ)=0 nếu |e|≤δ; ngoài vùng chết, f(e,δ)=sign(e)(|e|−δ). Khi q đủ lớn, cập nhật góc tham chiếu theo θ*_i,k+1 = sat[θ*_i,k + K_i f(e_i,δ_i), θ_i,min, θ_i,max]. Ngưỡng bật/tắt khác nhau hoặc thời gian xác nhận giúp tránh đổi chế độ do một mẫu nhiễu.</w:t>
+        <w:t>Trong cấu hình đề xuất, Arduino Mega (hoặc ESP32 nếu được dùng thay thế) đọc lần lượt điện trở R_TT, R_PT, R_TD và R_PD. Hai cặp cảm biến chéo được so sánh để xác định phía có điện trở nhỏ hơn; phía đó nhận ánh sáng mạnh hơn nên là hướng cần đưa tấm pin tới. Bộ điều khiển so sánh hai tổng phía trên–dưới và trái–phải với các ngưỡng δ_nghiêng, δ_quay.</w:t>
+      </w:r>
+    </w:p>
+    <w:p>
+      <w:pPr>
+        <w:ind w:firstLine="0"/>
+        <w:jc w:val="both"/>
+      </w:pPr>
+      <w:r>
+        <w:t>Đặt e_nghiêng = R_trên − R_dưới và e_quay = R_trái − R_phải. Mỗi bước có thể biểu diễn bằng θ*_{i,k+1} = sat(θ*_{i,k} + d_i·Δθ_i, θ_i,min, θ_i,max), trong đó i là trục nghiêng hoặc quay; d_i ∈ {−1, 0, +1} là chiều đã hiệu chuẩn để dịch chuyển về phía có điện trở nhỏ hơn, và d_i = 0 khi |e_i| ≤ δ_i. Hàm sat giới hạn góc trong hành trình cho phép. Motor nghiêng dùng PWM_nghiêng = round(255·u), với u là hệ số độ rộng xung 0 &lt; u ≤ 1, trong một thời gian bước đã hiệu chỉnh hoặc đến khi encoder xác nhận Δθ_nghiêng; servo cập nhật góc đặt theo bước Δθ_quay.</w:t>
       </w:r>
     </w:p>
     <w:p>
@@ -3030,20 +2959,7 @@
         <w:jc w:val="both"/>
       </w:pPr>
       <w:r>
-        <w:t>Servo phương vị nhận góc mục tiêu θ*_q. Với servo vị trí dùng xung, độ rộng xung đặt được ánh xạ tuyến tính trong vùng đã hiệu chuẩn: t_p = t_min + [(θ*_q − θ_q,min)/(θ_q,max − θ_q,min)](t_max − t_min), sau đó giới hạn trong [t_min,t_max]. t_min, t_max, tần số lặp và góc tương ứng phải lấy từ datasheet/hiệu chuẩn, không mặc định mọi servo có cùng dải xung.</w:t>
-      </w:r>
-    </w:p>
-    <w:p>
-      <w:pPr>
-        <w:spacing w:before="60" w:after="140"/>
-        <w:ind w:firstLine="0"/>
-        <w:jc w:val="center"/>
-      </w:pPr>
-      <w:r>
-        <w:rPr>
-          <w:i/>
-        </w:rPr>
-        <w:t>θ*_q,k+1 = sat[θ*_q,k + K_q f(e_quay, δ_q), θ_q,min, θ_q,max]</w:t>
+        <w:t>Nếu chênh lệch trên–dưới lớn hơn ngưỡng, cho động cơ nghiêng chạy một bước nhỏ về phía có tổng điện trở thấp hơn; sau đó dừng cơ cấu và chờ t_settle để hết rung. Khi độ nghiêng đã cân bằng trong ngưỡng, chuyển sang so sánh trái–phải; servo xoay tấm pin một bước nhỏ về phía có tổng điện trở thấp hơn. Sau mỗi bước, bộ điều khiển đọc lại bốn cảm biến và lặp lại phép so sánh.</w:t>
       </w:r>
     </w:p>
     <w:p>
@@ -3051,33 +2967,7 @@
         <w:jc w:val="both"/>
       </w:pPr>
       <w:r>
-        <w:t>Động cơ DC giảm tốc điều chỉnh độ nghiêng theo góc mục tiêu θ*_n. Encoder cung cấp góc đo θ_n; bộ PI tạo lệnh điều khiển có bão hòa, cầu H chọn chiều quay theo dấu lệnh và PWM theo trị tuyệt đối. Khi sai số vị trí nằm trong vùng chết, hoặc công tắc giới hạn theo hướng đang chạy tác động, PWM phải về 0.</w:t>
-      </w:r>
-    </w:p>
-    <w:p>
-      <w:pPr>
-        <w:spacing w:before="60" w:after="140"/>
-        <w:ind w:firstLine="0"/>
-        <w:jc w:val="center"/>
-      </w:pPr>
-      <w:r>
-        <w:rPr>
-          <w:i/>
-        </w:rPr>
-        <w:t>e_pos,n = θ*_n − θ_n ;   u_n = sat(K_p e_pos,n + K_i ∫e_pos,n dt, −u_max, +u_max)</w:t>
-      </w:r>
-    </w:p>
-    <w:p>
-      <w:pPr>
-        <w:spacing w:before="60" w:after="140"/>
-        <w:ind w:firstLine="0"/>
-        <w:jc w:val="center"/>
-      </w:pPr>
-      <w:r>
-        <w:rPr>
-          <w:i/>
-        </w:rPr>
-        <w:t>PWM_n = round[255 × |u_n| / u_max] ;   chiều motor = sign(u_n)</w:t>
+        <w:t>Khi cả hai cặp đều bằng nhau hoặc gần bằng nhau (|R_trên−R_dưới|≤δ_nghiêng và |R_trái−R_phải|≤δ_quay), dừng servo và motor. Bộ điều khiển chờ khoảng T_đọc rồi tự động đọc lại điện trở; nếu ánh sáng đã đổi làm một phía có điện trở nhỏ hơn, cơ cấu tiếp tục căn chỉnh theo cùng quy tắc. Thời gian T_đọc và t_settle được hiệu chỉnh theo tốc độ servo, motor và độ ổn định tín hiệu.</w:t>
       </w:r>
     </w:p>
     <w:p>
@@ -3085,7 +2975,68 @@
         <w:jc w:val="both"/>
       </w:pPr>
       <w:r>
-        <w:t>K_p, K_i, K_q, δ_q, δ_n cần được hiệu chỉnh trên mô hình, bắt đầu với khung không tải rồi tăng dần tải. Giới hạn mềm phải nằm bên trong giới hạn cứng; khi chạm công tắc, dừng motor theo hướng đi xa hơn nhưng cho phép chạy ngược để rời giới hạn. Nếu LDR bị tối/bão hòa, nhiễu nhanh hoặc mất kênh, đặt q thấp và chuyển sang góc thiên văn/giữ vị trí thay vì tiếp tục khuếch đại sai lệch.</w:t>
+        <w:t>Để tránh vượt hành trình, trước mỗi lệnh cần kiểm tra công tắc giới hạn tương ứng; nếu công tắc chặn hướng đang yêu cầu thì dừng trục đó, không tiếp tục cấp lệnh theo hướng ấy. Có thể dùng bộ định thời hoặc hàm millis() trên ESP32/Arduino để chờ T_đọc mà vẫn duy trì kiểm tra công tắc và trạng thái an toàn.</w:t>
+      </w:r>
+    </w:p>
+    <w:p>
+      <w:pPr>
+        <w:jc w:val="both"/>
+      </w:pPr>
+      <w:r>
+        <w:t>Lưu đồ dưới đây mô tả chu trình: khởi tạo → đọc bốn điện trở → so sánh chéo → căn chỉnh độ nghiêng → căn chỉnh hướng xoay → dừng khi gần cân bằng → chờ và đọc lại.</w:t>
+      </w:r>
+    </w:p>
+    <w:p>
+      <w:pPr>
+        <w:pageBreakBefore/>
+        <w:ind w:firstLine="0"/>
+        <w:jc w:val="center"/>
+      </w:pPr>
+      <w:r/>
+      <w:r/>
+      <w:r>
+        <w:drawing>
+          <wp:inline xmlns:a="http://schemas.openxmlformats.org/drawingml/2006/main" xmlns:pic="http://schemas.openxmlformats.org/drawingml/2006/picture">
+            <wp:extent cx="5074920" cy="6303585"/>
+            <wp:docPr id="1" name="Picture 1"/>
+            <wp:cNvGraphicFramePr>
+              <a:graphicFrameLocks noChangeAspect="1"/>
+            </wp:cNvGraphicFramePr>
+            <a:graphic>
+              <a:graphicData uri="http://schemas.openxmlformats.org/drawingml/2006/picture">
+                <pic:pic>
+                  <pic:nvPicPr>
+                    <pic:cNvPr id="0" name="image.png"/>
+                    <pic:cNvPicPr/>
+                  </pic:nvPicPr>
+                  <pic:blipFill>
+                    <a:blip r:embed="rId23"/>
+                    <a:stretch>
+                      <a:fillRect/>
+                    </a:stretch>
+                  </pic:blipFill>
+                  <pic:spPr>
+                    <a:xfrm>
+                      <a:off x="0" y="0"/>
+                      <a:ext cx="5074920" cy="6303585"/>
+                    </a:xfrm>
+                    <a:prstGeom prst="rect"/>
+                  </pic:spPr>
+                </pic:pic>
+              </a:graphicData>
+            </a:graphic>
+          </wp:inline>
+        </w:drawing>
+      </w:r>
+    </w:p>
+    <w:p>
+      <w:pPr>
+        <w:pStyle w:val="Caption"/>
+        <w:ind w:firstLine="0"/>
+        <w:jc w:val="center"/>
+      </w:pPr>
+      <w:r>
+        <w:t>Hình 3.1. Lưu đồ thuật toán điều khiển hai trục bằng so sánh điện trở của bốn LDR.</w:t>
       </w:r>
     </w:p>
     <w:p>
@@ -3133,7 +3084,7 @@
         <w:jc w:val="both"/>
       </w:pPr>
       <w:r>
-        <w:t>Khi thử, so sánh tấm cố định, góc thiên văn, phản hồi LDR và điều khiển lai. Ghi bốn tín hiệu LDR, e_quay, e_nghiêng, góc mục tiêu, góc encoder, thời gian servo/motor hoạt động, điện áp–dòng PV, năng lượng từng actuator và trạng thái thời tiết. Tính sai số góc hai trục, số lần chuyển động và năng lượng thuần sau khi trừ toàn bộ điện năng phụ trợ; chưa có số liệu thì không kết luận định lượng.</w:t>
+        <w:t>Khi thử, so sánh tấm pin cố định với thuật toán điều khiển bằng bốn LDR. Ghi R_TT, R_PT, R_TD, R_PD; hai tổng chênh lệch; góc servo; góc encoder; thời gian motor hoạt động; điện áp–dòng PV; năng lượng từng cơ cấu; và thời tiết. Tính thời gian cần để đạt cân bằng, số lần chuyển động, sai số còn lại và năng lượng thuần sau khi trừ điện năng phụ trợ; chưa có số liệu thì không kết luận định lượng.</w:t>
       </w:r>
     </w:p>
     <w:p>

</xml_diff>